<commit_message>
fix(mop-wizy): clean parasites, static toc, header data-bind injection
</commit_message>
<xml_diff>
--- a/docs/mop/OPSSD-03.03.M0.20-P-V1.docx
+++ b/docs/mop/OPSSD-03.03.M0.20-P-V1.docx
@@ -12,7 +12,7 @@
           <w:color w:val="1F3864"/>
           <w:sz w:val="32"/>
         </w:rPr>
-        <w:t>MOP — Supervision OTN/OOB : déconnexion et perte de lien</w:t>
+        <w:t>Perte de Supervision</w:t>
       </w:r>
     </w:p>
     <w:p>
@@ -121,7 +121,7 @@
                 <w:b w:val="0"/>
                 <w:sz w:val="18"/>
               </w:rPr>
-              <w:t>MOP — Supervision OTN/OOB : déconnexion et perte de lien</w:t>
+              <w:t>Perte de Supervision</w:t>
             </w:r>
           </w:p>
         </w:tc>
@@ -319,7 +319,7 @@
                 <w:b w:val="0"/>
                 <w:sz w:val="18"/>
               </w:rPr>
-              <w:t>À compléter (DD/MM/YYYY)</w:t>
+              <w:t>01/03/2026</w:t>
             </w:r>
           </w:p>
         </w:tc>
@@ -352,7 +352,7 @@
                 <w:b w:val="0"/>
                 <w:sz w:val="18"/>
               </w:rPr>
-              <w:t>À compléter (DD/MM/YYYY)</w:t>
+              <w:t>01/03/2028</w:t>
             </w:r>
           </w:p>
         </w:tc>
@@ -496,7 +496,7 @@
                 <w:b w:val="0"/>
                 <w:sz w:val="18"/>
               </w:rPr>
-              <w:t>À compléter (DD/MM/YYYY)</w:t>
+              <w:t>01/04/2026</w:t>
             </w:r>
           </w:p>
         </w:tc>
@@ -565,7 +565,7 @@
         <w:rPr>
           <w:sz w:val="20"/>
         </w:rPr>
-        <w:t>Procédure d'intervention pour incidents de supervision (Lightsoft/OOB) affectant la visibilité des équipements OTN.</w:t>
+        <w:t>Procédure d'interventionsuite à la perte  de supervision (Lightsoft/Vizee) affectant la visibilité des équipements OTN.</w:t>
       </w:r>
     </w:p>
     <w:p/>
@@ -579,6 +579,22 @@
           <w:sz w:val="18"/>
         </w:rPr>
         <w:t>ÉQUIPEMENTS COUVERTS</w:t>
+      </w:r>
+    </w:p>
+    <w:p>
+      <w:r>
+        <w:rPr>
+          <w:sz w:val="18"/>
+        </w:rPr>
+        <w:t>Lighsoft : Poste OOB</w:t>
+      </w:r>
+    </w:p>
+    <w:p>
+      <w:r>
+        <w:rPr>
+          <w:sz w:val="18"/>
+        </w:rPr>
+        <w:t>Vizee : dash-4uvocd.vizee.io</w:t>
       </w:r>
     </w:p>
     <w:p>
@@ -602,7 +618,7 @@
         <w:rPr>
           <w:sz w:val="18"/>
         </w:rPr>
-        <w:t>Serveur console : Opengear CM7000 (TH2-CON-01, TH3-CON-01)</w:t>
+        <w:t>Serveur Console : Opengear CM7000 (TH2-CON-01, TH3-CON-01)</w:t>
       </w:r>
     </w:p>
     <w:p>
@@ -610,15 +626,7 @@
         <w:rPr>
           <w:sz w:val="18"/>
         </w:rPr>
-        <w:t>Serveur Radius : Radiator Mini Pack (2 serveurs licenciés)</w:t>
-      </w:r>
-    </w:p>
-    <w:p>
-      <w:r>
-        <w:rPr>
-          <w:sz w:val="18"/>
-        </w:rPr>
-        <w:t>Vizee : dash-4uvocd.vizee.io (supervision centralisée)</w:t>
+        <w:t>Serveur Radius : Radiator Mini Pack</w:t>
       </w:r>
     </w:p>
     <w:p/>
@@ -639,7 +647,7 @@
         <w:rPr>
           <w:sz w:val="18"/>
         </w:rPr>
-        <w:t>Lugos astreinte technique : 07 80 90 10 70</w:t>
+        <w:t>Support Supervision OOB : lugos.atlassian.net (login otn.noc)</w:t>
       </w:r>
     </w:p>
     <w:p>
@@ -647,7 +655,7 @@
         <w:rPr>
           <w:sz w:val="18"/>
         </w:rPr>
-        <w:t>Lugos astreinte manager : 07 80 90 10 50</w:t>
+        <w:t>Telehouse : OTN.Management@fr.telehouse.net</w:t>
       </w:r>
     </w:p>
     <w:p>
@@ -655,15 +663,7 @@
         <w:rPr>
           <w:sz w:val="18"/>
         </w:rPr>
-        <w:t>Portail tickets : lugos.atlassian.net (login otn.noc — voir runbook contacts LUGOS)</w:t>
-      </w:r>
-    </w:p>
-    <w:p>
-      <w:r>
-        <w:rPr>
-          <w:sz w:val="18"/>
-        </w:rPr>
-        <w:t>LightSoft NOC : OTN.NOC@fr.telehouse.net</w:t>
+        <w:t>Escalade Telehouse N+1</w:t>
       </w:r>
     </w:p>
     <w:p>
@@ -687,7 +687,7 @@
         <w:rPr>
           <w:sz w:val="20"/>
         </w:rPr>
-        <w:t>Symptômes couverts : Alarme MAJOR 'No OSPF hello packets received from neighbor' sur noeuds VHB — auto-cleared en &lt;30s; Alerte Vizee: Restart/bascule du firewall OOB (TH2-FW-01); Cogent prend le relai automatiquement; Coupure backbone Cogent.</w:t>
+        <w:t>Symptômes couverts : Alerte Vizee: Restart/bascule du firewall (THx-FW-0x) ; Alarme operateur OOB (Cogent euNetworks); Alarme 'No OSPF hello packets received from neighbor' auto-cleared en &lt;30s;</w:t>
       </w:r>
     </w:p>
     <w:p/>
@@ -707,7 +707,7 @@
         <w:rPr>
           <w:sz w:val="20"/>
         </w:rPr>
-        <w:t>Responsable : NOC / Ingénieur transmission.</w:t>
+        <w:t>Responsable : Service Desk</w:t>
       </w:r>
     </w:p>
     <w:p>
@@ -715,7 +715,7 @@
         <w:rPr>
           <w:sz w:val="20"/>
         </w:rPr>
-        <w:t>Criticitées : MINEUR, MINEUR→MAJEUR, CRITIQUE, MAJEUR.</w:t>
+        <w:t>Criticitées : MINEUR, MINEUR→MAJEUR</w:t>
       </w:r>
     </w:p>
     <w:p>
@@ -749,7 +749,7 @@
         <w:rPr>
           <w:sz w:val="20"/>
         </w:rPr>
-        <w:t>Contexte terrain (REX 2022-2026, 14 incidents documentés) : incidents supervision majoritairement liés aux pertes de lien OOB (Cogent, switch), bascules Firewall Fortigate et alarmes OSPF auto-cleared sur réseau GCC Ribbon. TTR moyen : 15–45 min ; alarmes OSPF typiquement cleared &lt; 30s (protection switch PHO corrélé).</w:t>
+        <w:t>Retour d'expérience: Les alarmede supervision sont majoritairement liés aux pertes de lien OOB (Cogent, switch), aux bascules du Firewall Fortigate et alarmes OSPF auto-cleared sur PHO/ Ribbon. Le TTR moyen : 15–45 min ; (alarmes OSPF typiquement cleared &lt; 30s) (protection switch PHO corrélé).</w:t>
       </w:r>
     </w:p>
     <w:p>
@@ -776,7 +776,7 @@
         <w:rPr>
           <w:sz w:val="20"/>
         </w:rPr>
-        <w:t>Acquitter alarmes Lightsoft/Vizee.</w:t>
+        <w:t>Acquitter alarmes Lightsoft/Vizee (mail).</w:t>
       </w:r>
     </w:p>
     <w:p>
@@ -787,7 +787,7 @@
         <w:rPr>
           <w:sz w:val="20"/>
         </w:rPr>
-        <w:t>Sur CLI équipement : show logged alarms 0 | grep &lt;date&gt; (nœud root@&lt;NE&gt;)</w:t>
+        <w:t>Vérifier le planning de maintenance</w:t>
       </w:r>
     </w:p>
     <w:p>
@@ -798,18 +798,7 @@
         <w:rPr>
           <w:sz w:val="20"/>
         </w:rPr>
-        <w:t>Vérifier état OOB : ping TH2/TH3-SW-01 depuis LightSoft.</w:t>
-      </w:r>
-    </w:p>
-    <w:p>
-      <w:pPr>
-        <w:pStyle w:val="ListNumber"/>
-      </w:pPr>
-      <w:r>
-        <w:rPr>
-          <w:sz w:val="20"/>
-        </w:rPr>
-        <w:t>Consulter Vizee (dash-4uvocd.vizee.io) — comparer état NE sur les deux sites.</w:t>
+        <w:t>Consulter Vizee (dash-4uvocd.vizee.io), comparer état NE sur les deux sites.</w:t>
       </w:r>
     </w:p>
     <w:p>
@@ -828,29 +817,7 @@
         <w:rPr>
           <w:sz w:val="20"/>
         </w:rPr>
-        <w:t>Appliquer SOP-01 (diagnostic initial) → SOP-03 si perte STMS.</w:t>
-      </w:r>
-    </w:p>
-    <w:p>
-      <w:pPr>
-        <w:pStyle w:val="ListNumber"/>
-      </w:pPr>
-      <w:r>
-        <w:rPr>
-          <w:sz w:val="20"/>
-        </w:rPr>
-        <w:t>Vérifier firewall cluster TH2-FW-01 / TH3-FW-01 (bascule ?)</w:t>
-      </w:r>
-    </w:p>
-    <w:p>
-      <w:pPr>
-        <w:pStyle w:val="ListNumber"/>
-      </w:pPr>
-      <w:r>
-        <w:rPr>
-          <w:sz w:val="20"/>
-        </w:rPr>
-        <w:t>Vérifier switch OOB actif (TH2-SW-01/02 via console Opengear).</w:t>
+        <w:t>Appliquer Vérification OOB &amp; Accès management 10-SOP (diagnostic initial) → 15-SOP Escalade Ribbon si perte STMS.</w:t>
       </w:r>
     </w:p>
     <w:p>
@@ -862,6 +829,28 @@
           <w:sz w:val="20"/>
         </w:rPr>
         <w:t>Si Radius bloqué (A1) : contacter Lugos astreinte — réinitialisation compte.</w:t>
+      </w:r>
+    </w:p>
+    <w:p>
+      <w:pPr>
+        <w:pStyle w:val="ListNumber"/>
+      </w:pPr>
+      <w:r>
+        <w:rPr>
+          <w:sz w:val="20"/>
+        </w:rPr>
+        <w:t>Vérifier switch OOB actif (THx-SW-01/02).</w:t>
+      </w:r>
+    </w:p>
+    <w:p>
+      <w:pPr>
+        <w:pStyle w:val="ListNumber"/>
+      </w:pPr>
+      <w:r>
+        <w:rPr>
+          <w:sz w:val="20"/>
+        </w:rPr>
+        <w:t>Vérifier firewall cluster THx-FW-01 / TH3-FW-01 (bascule ?)</w:t>
       </w:r>
     </w:p>
     <w:p>
@@ -880,7 +869,7 @@
         <w:rPr>
           <w:sz w:val="20"/>
         </w:rPr>
-        <w:t>Appliquer la SOP identifiée en Phase 2.</w:t>
+        <w:t>Appliquer la SOP identifiée en Etape 2.</w:t>
       </w:r>
     </w:p>
     <w:p>
@@ -891,29 +880,7 @@
         <w:rPr>
           <w:sz w:val="20"/>
         </w:rPr>
-        <w:t>Si échange matériel : contacter astreinte + ouvrir ticket RMA Lugos.</w:t>
-      </w:r>
-    </w:p>
-    <w:p>
-      <w:pPr>
-        <w:pStyle w:val="ListNumber"/>
-      </w:pPr>
-      <w:r>
-        <w:rPr>
-          <w:sz w:val="20"/>
-        </w:rPr>
-        <w:t>Documenter actions dans NocoDB (TTR, cause, actions).</w:t>
-      </w:r>
-    </w:p>
-    <w:p>
-      <w:pPr>
-        <w:pStyle w:val="ListNumber"/>
-      </w:pPr>
-      <w:r>
-        <w:rPr>
-          <w:sz w:val="20"/>
-        </w:rPr>
-        <w:t>Vérifier reprise supervision Lightsoft/Vizee.</w:t>
+        <w:t>Documenter les actions</w:t>
       </w:r>
     </w:p>
     <w:p>
@@ -943,7 +910,7 @@
         <w:rPr>
           <w:sz w:val="20"/>
         </w:rPr>
-        <w:t>Clôturer ticket NocoDB (TTR réel, cause racine, actions correctives).</w:t>
+        <w:t>Clôturer le ticket (TTR réel, cause racine, actions correctives).</w:t>
       </w:r>
     </w:p>
     <w:p>
@@ -954,18 +921,7 @@
         <w:rPr>
           <w:sz w:val="20"/>
         </w:rPr>
-        <w:t>Si incident récurrent : escalader vers ingénierie pour analyse RCA.</w:t>
-      </w:r>
-    </w:p>
-    <w:p>
-      <w:pPr>
-        <w:pStyle w:val="ListNumber"/>
-      </w:pPr>
-      <w:r>
-        <w:rPr>
-          <w:sz w:val="20"/>
-        </w:rPr>
-        <w:t>Mettre à jour la présente MOP si nouveau pattern identifié.</w:t>
+        <w:t>Si incident récurrent : escalader pour analyse RCA.</w:t>
       </w:r>
     </w:p>
     <w:p/>
@@ -985,7 +941,7 @@
         <w:rPr>
           <w:sz w:val="20"/>
         </w:rPr>
-        <w:t>OOB : Out Of Band — accès externe NE disponible même si réseau interne indisponible.</w:t>
+        <w:t>OOB : Out Of Band, Réseau externe des NE disponible même si réseau interne indisponible.</w:t>
       </w:r>
     </w:p>
     <w:p>
@@ -993,7 +949,7 @@
         <w:rPr>
           <w:sz w:val="20"/>
         </w:rPr>
-        <w:t>NE : Network Element — équipement optique Ribbon Apollo.</w:t>
+        <w:t>NE : Network Element,  équipement optique Ribbon.</w:t>
       </w:r>
     </w:p>
     <w:p>
@@ -1001,7 +957,7 @@
         <w:rPr>
           <w:sz w:val="20"/>
         </w:rPr>
-        <w:t>LightSoft/EMS : serveurs Ribbon permettant supervision et exploitation des NE.</w:t>
+        <w:t>LightSoft/EMS : Logiciel de management des equipement Ribbon</w:t>
       </w:r>
     </w:p>
     <w:p>
@@ -1017,7 +973,7 @@
         <w:rPr>
           <w:sz w:val="20"/>
         </w:rPr>
-        <w:t>OSPF : protocole de routage interne réseau de gestion Ribbon (canal GCC).</w:t>
+        <w:t>OSPF : protocole de routage interne réseau de gestion Ribbon (NN).</w:t>
       </w:r>
     </w:p>
     <w:p>

</xml_diff>

<commit_message>
fix(mop-docx): A4 format, marges, colonnes cover, multiline content, BR textrun
- generate-mop-batch.py : page A4 (21×29.7cm) + marges 2.5/2/2cm (B1+B2)
- build_cover_table : autofit=False + colonnes 5/11.5cm 30/70% (B3)
- doc_resume + s3_content : add_multiline_content() au lieu de add_run() (B4+B5)
- server.js : page size A4 dans section properties (A2)
- server.js : \n→\r dans TextRun pour produire w:br en DOCX (A1)

Co-Authored-By: Claude Sonnet 4.6 <noreply@anthropic.com>
</commit_message>
<xml_diff>
--- a/docs/mop/OPSSD-03.03.M0.20-P-V1.docx
+++ b/docs/mop/OPSSD-03.03.M0.20-P-V1.docx
@@ -32,16 +32,17 @@
         <w:tblStyle w:val="TableGrid"/>
         <w:tblW w:type="auto" w:w="0"/>
         <w:jc w:val="center"/>
+        <w:tblLayout w:type="fixed"/>
         <w:tblLook w:firstColumn="1" w:firstRow="1" w:lastColumn="0" w:lastRow="0" w:noHBand="0" w:noVBand="1" w:val="04A0"/>
       </w:tblPr>
       <w:tblGrid>
-        <w:gridCol w:w="4320"/>
-        <w:gridCol w:w="4320"/>
+        <w:gridCol w:w="4677"/>
+        <w:gridCol w:w="4677"/>
       </w:tblGrid>
       <w:tr>
         <w:tc>
           <w:tcPr>
-            <w:tcW w:type="dxa" w:w="8640"/>
+            <w:tcW w:type="dxa" w:w="9354"/>
             <w:gridSpan w:val="2"/>
             <w:shd w:val="clear" w:color="auto" w:fill="1F3864"/>
           </w:tcPr>
@@ -63,7 +64,7 @@
       <w:tr>
         <w:tc>
           <w:tcPr>
-            <w:tcW w:type="dxa" w:w="4320"/>
+            <w:tcW w:type="dxa" w:w="2835"/>
             <w:shd w:val="clear" w:color="auto" w:fill="BDD7EE"/>
           </w:tcPr>
           <w:p>
@@ -79,7 +80,7 @@
         </w:tc>
         <w:tc>
           <w:tcPr>
-            <w:tcW w:type="dxa" w:w="4320"/>
+            <w:tcW w:type="dxa" w:w="6520"/>
           </w:tcPr>
           <w:p>
             <w:r/>
@@ -96,7 +97,7 @@
       <w:tr>
         <w:tc>
           <w:tcPr>
-            <w:tcW w:type="dxa" w:w="4320"/>
+            <w:tcW w:type="dxa" w:w="2835"/>
             <w:shd w:val="clear" w:color="auto" w:fill="BDD7EE"/>
           </w:tcPr>
           <w:p>
@@ -112,7 +113,7 @@
         </w:tc>
         <w:tc>
           <w:tcPr>
-            <w:tcW w:type="dxa" w:w="4320"/>
+            <w:tcW w:type="dxa" w:w="6520"/>
           </w:tcPr>
           <w:p>
             <w:r/>
@@ -129,7 +130,7 @@
       <w:tr>
         <w:tc>
           <w:tcPr>
-            <w:tcW w:type="dxa" w:w="4320"/>
+            <w:tcW w:type="dxa" w:w="2835"/>
             <w:shd w:val="clear" w:color="auto" w:fill="BDD7EE"/>
           </w:tcPr>
           <w:p>
@@ -145,7 +146,7 @@
         </w:tc>
         <w:tc>
           <w:tcPr>
-            <w:tcW w:type="dxa" w:w="4320"/>
+            <w:tcW w:type="dxa" w:w="6520"/>
           </w:tcPr>
           <w:p>
             <w:r/>
@@ -162,7 +163,7 @@
       <w:tr>
         <w:tc>
           <w:tcPr>
-            <w:tcW w:type="dxa" w:w="4320"/>
+            <w:tcW w:type="dxa" w:w="2835"/>
             <w:shd w:val="clear" w:color="auto" w:fill="BDD7EE"/>
           </w:tcPr>
           <w:p>
@@ -178,7 +179,7 @@
         </w:tc>
         <w:tc>
           <w:tcPr>
-            <w:tcW w:type="dxa" w:w="4320"/>
+            <w:tcW w:type="dxa" w:w="6520"/>
           </w:tcPr>
           <w:p>
             <w:r/>
@@ -195,7 +196,7 @@
       <w:tr>
         <w:tc>
           <w:tcPr>
-            <w:tcW w:type="dxa" w:w="4320"/>
+            <w:tcW w:type="dxa" w:w="2835"/>
             <w:shd w:val="clear" w:color="auto" w:fill="BDD7EE"/>
           </w:tcPr>
           <w:p>
@@ -211,7 +212,7 @@
         </w:tc>
         <w:tc>
           <w:tcPr>
-            <w:tcW w:type="dxa" w:w="4320"/>
+            <w:tcW w:type="dxa" w:w="6520"/>
           </w:tcPr>
           <w:p>
             <w:r/>
@@ -228,7 +229,7 @@
       <w:tr>
         <w:tc>
           <w:tcPr>
-            <w:tcW w:type="dxa" w:w="4320"/>
+            <w:tcW w:type="dxa" w:w="2835"/>
             <w:shd w:val="clear" w:color="auto" w:fill="BDD7EE"/>
           </w:tcPr>
           <w:p>
@@ -244,7 +245,7 @@
         </w:tc>
         <w:tc>
           <w:tcPr>
-            <w:tcW w:type="dxa" w:w="4320"/>
+            <w:tcW w:type="dxa" w:w="6520"/>
           </w:tcPr>
           <w:p>
             <w:r/>
@@ -261,7 +262,7 @@
       <w:tr>
         <w:tc>
           <w:tcPr>
-            <w:tcW w:type="dxa" w:w="4320"/>
+            <w:tcW w:type="dxa" w:w="2835"/>
             <w:shd w:val="clear" w:color="auto" w:fill="BDD7EE"/>
           </w:tcPr>
           <w:p>
@@ -277,7 +278,7 @@
         </w:tc>
         <w:tc>
           <w:tcPr>
-            <w:tcW w:type="dxa" w:w="4320"/>
+            <w:tcW w:type="dxa" w:w="6520"/>
           </w:tcPr>
           <w:p>
             <w:r/>
@@ -294,7 +295,7 @@
       <w:tr>
         <w:tc>
           <w:tcPr>
-            <w:tcW w:type="dxa" w:w="4320"/>
+            <w:tcW w:type="dxa" w:w="2835"/>
             <w:shd w:val="clear" w:color="auto" w:fill="BDD7EE"/>
           </w:tcPr>
           <w:p>
@@ -310,7 +311,7 @@
         </w:tc>
         <w:tc>
           <w:tcPr>
-            <w:tcW w:type="dxa" w:w="4320"/>
+            <w:tcW w:type="dxa" w:w="6520"/>
           </w:tcPr>
           <w:p>
             <w:r/>
@@ -327,7 +328,7 @@
       <w:tr>
         <w:tc>
           <w:tcPr>
-            <w:tcW w:type="dxa" w:w="4320"/>
+            <w:tcW w:type="dxa" w:w="2835"/>
             <w:shd w:val="clear" w:color="auto" w:fill="BDD7EE"/>
           </w:tcPr>
           <w:p>
@@ -343,7 +344,7 @@
         </w:tc>
         <w:tc>
           <w:tcPr>
-            <w:tcW w:type="dxa" w:w="4320"/>
+            <w:tcW w:type="dxa" w:w="6520"/>
           </w:tcPr>
           <w:p>
             <w:r/>
@@ -376,16 +377,16 @@
         <w:tblLook w:firstColumn="1" w:firstRow="1" w:lastColumn="0" w:lastRow="0" w:noHBand="0" w:noVBand="1" w:val="04A0"/>
       </w:tblPr>
       <w:tblGrid>
-        <w:gridCol w:w="1728"/>
-        <w:gridCol w:w="1728"/>
-        <w:gridCol w:w="1728"/>
-        <w:gridCol w:w="1728"/>
-        <w:gridCol w:w="1728"/>
+        <w:gridCol w:w="1871"/>
+        <w:gridCol w:w="1871"/>
+        <w:gridCol w:w="1871"/>
+        <w:gridCol w:w="1871"/>
+        <w:gridCol w:w="1871"/>
       </w:tblGrid>
       <w:tr>
         <w:tc>
           <w:tcPr>
-            <w:tcW w:type="dxa" w:w="1728"/>
+            <w:tcW w:type="dxa" w:w="1871"/>
             <w:shd w:val="clear" w:color="auto" w:fill="1F3864"/>
           </w:tcPr>
           <w:p>
@@ -402,7 +403,7 @@
         </w:tc>
         <w:tc>
           <w:tcPr>
-            <w:tcW w:type="dxa" w:w="1728"/>
+            <w:tcW w:type="dxa" w:w="1871"/>
             <w:shd w:val="clear" w:color="auto" w:fill="1F3864"/>
           </w:tcPr>
           <w:p>
@@ -419,7 +420,7 @@
         </w:tc>
         <w:tc>
           <w:tcPr>
-            <w:tcW w:type="dxa" w:w="1728"/>
+            <w:tcW w:type="dxa" w:w="1871"/>
             <w:shd w:val="clear" w:color="auto" w:fill="1F3864"/>
           </w:tcPr>
           <w:p>
@@ -436,7 +437,7 @@
         </w:tc>
         <w:tc>
           <w:tcPr>
-            <w:tcW w:type="dxa" w:w="1728"/>
+            <w:tcW w:type="dxa" w:w="1871"/>
             <w:shd w:val="clear" w:color="auto" w:fill="1F3864"/>
           </w:tcPr>
           <w:p>
@@ -453,7 +454,7 @@
         </w:tc>
         <w:tc>
           <w:tcPr>
-            <w:tcW w:type="dxa" w:w="1728"/>
+            <w:tcW w:type="dxa" w:w="1871"/>
             <w:shd w:val="clear" w:color="auto" w:fill="1F3864"/>
           </w:tcPr>
           <w:p>
@@ -472,7 +473,7 @@
       <w:tr>
         <w:tc>
           <w:tcPr>
-            <w:tcW w:type="dxa" w:w="1728"/>
+            <w:tcW w:type="dxa" w:w="1871"/>
           </w:tcPr>
           <w:p>
             <w:r/>
@@ -487,7 +488,7 @@
         </w:tc>
         <w:tc>
           <w:tcPr>
-            <w:tcW w:type="dxa" w:w="1728"/>
+            <w:tcW w:type="dxa" w:w="1871"/>
           </w:tcPr>
           <w:p>
             <w:r/>
@@ -502,7 +503,7 @@
         </w:tc>
         <w:tc>
           <w:tcPr>
-            <w:tcW w:type="dxa" w:w="1728"/>
+            <w:tcW w:type="dxa" w:w="1871"/>
           </w:tcPr>
           <w:p>
             <w:r/>
@@ -517,7 +518,7 @@
         </w:tc>
         <w:tc>
           <w:tcPr>
-            <w:tcW w:type="dxa" w:w="1728"/>
+            <w:tcW w:type="dxa" w:w="1871"/>
           </w:tcPr>
           <w:p>
             <w:r/>
@@ -532,7 +533,7 @@
         </w:tc>
         <w:tc>
           <w:tcPr>
-            <w:tcW w:type="dxa" w:w="1728"/>
+            <w:tcW w:type="dxa" w:w="1871"/>
           </w:tcPr>
           <w:p>
             <w:r/>
@@ -745,6 +746,8 @@
         </w:rPr>
         <w:t xml:space="preserve">Contexte terrain : </w:t>
       </w:r>
+    </w:p>
+    <w:p>
       <w:r>
         <w:rPr>
           <w:sz w:val="20"/>
@@ -1009,8 +1012,8 @@
       </w:r>
     </w:p>
     <w:sectPr>
-      <w:pgSz w:w="12240" w:h="15840"/>
-      <w:pgMar w:top="1440" w:right="1800" w:bottom="1440" w:left="1800" w:header="720" w:footer="720" w:gutter="0"/>
+      <w:pgSz w:w="11906" w:h="16838"/>
+      <w:pgMar w:top="1134" w:right="1134" w:bottom="1134" w:left="1417" w:header="720" w:footer="720" w:gutter="0"/>
       <w:cols w:space="720"/>
       <w:docGrid w:linePitch="360"/>
     </w:sectPr>

</xml_diff>